<commit_message>
Aligner le coût de la plateforme sur la référence 2025 (1,6 M€ / 4,3 M dossiers = 0,37 €/dossier)
Co-Authored-By: Claude Sonnet 5 <noreply@anthropic.com>
Claude-Session: https://claude.ai/code/session_01EFvC82jPQ4GMezxaduP3tk
</commit_message>
<xml_diff>
--- a/note/moins-de-charge-pour-l-usager-moins-de-couts-pour-l-etat.docx
+++ b/note/moins-de-charge-pour-l-usager-moins-de-couts-pour-l-etat.docx
@@ -513,7 +513,7 @@
             </w:r>
             <w:proofErr w:type="gramEnd"/>
             <w:r>
-              <w:t xml:space="preserve"> des dossiers et le remplissage par l'usager sont comparés. Rapportés au seul coût de la plateforme (14 M€ au plus),</w:t>
+              <w:t xml:space="preserve"> des dossiers et le remplissage par l'usager sont comparés. Rapportés au seul coût de la plateforme (6,8 M€ à la référence 2025),</w:t>
             </w:r>
             <w:r>
               <w:rPr>
@@ -522,7 +522,7 @@
               <w:footnoteReference w:id="2"/>
             </w:r>
             <w:r>
-              <w:t xml:space="preserve"> les gains représentent 11 à 22 fois ce coût ; en imputant en totalité le temps de mise en place des services (de 42 à 130 M€), le rapport reste de 1 à 5,5, et d'environ 2,5 à hypothèses appariées.</w:t>
+              <w:t xml:space="preserve"> les gains représentent 24 à 46 fois ce coût ; en imputant en totalité le temps de mise en place des services (de 42 à 130 M€), le rapport reste de 1,2 à 6,3, et d'environ 2,8 à hypothèses appariées.</w:t>
             </w:r>
           </w:p>
           <w:p>
@@ -1960,7 +1960,7 @@
                 <w:sz w:val="19"/>
                 <w:szCs w:val="19"/>
               </w:rPr>
-              <w:t>. Le rapport gains / coûts passe alors de 11 à 22 (rapporté au seul coût de la plateforme, 14 M€ au plus) à 1 à 5,5, soit environ 2,5 lorsque les hypothèses basses et hautes sont associées.</w:t>
+              <w:t>. Le rapport gains / coûts passe alors de 24 à 46 (rapporté au seul coût de la plateforme, 6,8 M€) à 1,2 à 6,3, soit environ 2,8 lorsque les hypothèses basses et hautes sont associées.</w:t>
             </w:r>
           </w:p>
         </w:tc>
@@ -2029,7 +2029,7 @@
         <w:t xml:space="preserve">Rapport gains / coûts. </w:t>
       </w:r>
       <w:r>
-        <w:t>Mis en regard du seul coût de la plateforme (14 M€ au plus), les gains cumulés de 161 à 309 M€ représentent de 11 à 22 fois ce coût. Il faut lire ce rapport avec prudence : les gains sont des temps et des coûts valorisés, pas des économies budgétaires. En imputant en totalité le temps de mise en place des services (de 42 à 130 M€, soit au plus 56 à 144 M€ avec la plateforme), il reste de 1 à 5,5, et d'environ 2,5 lorsque les hypothèses basses et hautes sont associées entre elles.</w:t>
+        <w:t>Mis en regard du seul coût de la plateforme (6,8 M€ à la référence 2025), les gains cumulés de 161 à 309 M€ représentent de 24 à 46 fois ce coût. Il faut lire ce rapport avec prudence : les gains sont des temps et des coûts valorisés, pas des économies budgétaires. En imputant en totalité le temps de mise en place des services (de 42 à 130 M€, soit 49 à 137 M€ avec la plateforme), il reste de 1,2 à 6,3, et d'environ 2,8 lorsque les hypothèses basses et hautes sont associées entre elles.</w:t>
       </w:r>
     </w:p>
     <w:p>
@@ -3990,7 +3990,7 @@
                 <w:sz w:val="18"/>
                 <w:szCs w:val="18"/>
               </w:rPr>
-              <w:t>Coût de la plateforme, construction et exploitation, 2018-2026</w:t>
+              <w:t>Coût de la plateforme (référence 2025)</w:t>
             </w:r>
           </w:p>
         </w:tc>
@@ -4016,7 +4016,7 @@
                 <w:sz w:val="18"/>
                 <w:szCs w:val="18"/>
               </w:rPr>
-              <w:t>14 M€ (estimation haute)</w:t>
+              <w:t>0,37 € par dossier, soit 6,8 M€ pour 18,2 millions de dossiers</w:t>
             </w:r>
           </w:p>
         </w:tc>
@@ -4052,7 +4052,7 @@
                   <w:szCs w:val="18"/>
                   <w:u w:val="single"/>
                 </w:rPr>
-                <w:t>autorisations d'engagement 2018-2025 : 11,9 M€</w:t>
+                <w:t>1,6 M€ pour 4,3 millions de dossiers en 2025</w:t>
               </w:r>
             </w:hyperlink>
             <w:r>
@@ -4060,7 +4060,7 @@
                 <w:sz w:val="18"/>
                 <w:szCs w:val="18"/>
               </w:rPr>
-              <w:t>), complété d'une estimation haute pour 2026 ; total arrondi au million supérieur</w:t>
+              <w:t>). Contrôle : les autorisations d'engagement 2018-2025 s'élèvent à 11,9 M€.</w:t>
             </w:r>
           </w:p>
         </w:tc>
@@ -7486,7 +7486,7 @@
           <w:sz w:val="16"/>
           <w:szCs w:val="16"/>
         </w:rPr>
-        <w:t xml:space="preserve">Coût de construction et d'exploitation de la plateforme, 2018-2026 : </w:t>
+        <w:t xml:space="preserve">Coût de la plateforme, référence 2025 : </w:t>
       </w:r>
       <w:hyperlink r:id="rId1" w:history="1">
         <w:r>
@@ -7504,7 +7504,7 @@
           <w:sz w:val="16"/>
           <w:szCs w:val="16"/>
         </w:rPr>
-        <w:t xml:space="preserve"> (autorisations d'engagement 2018-2025 : 11,9 M€), complété d'une estimation haute pour 2026 ; total arrondi au million supérieur, soit une estimation haute de l'investissement. Voir aussi la </w:t>
+        <w:t xml:space="preserve"> (1,6 M€ pour 4,3 millions de dossiers déposés en 2025, soit 0,37 € par dossier), soit 6,8 M€ pour les 18,2 millions de dossiers déposés depuis 2018. À titre de contrôle, les autorisations d'engagement 2018-2025 s'élèvent à 11,9 M€ : rapportés à ce montant, les gains représentent 13 à 26 fois ce coût. Voir aussi la </w:t>
       </w:r>
       <w:hyperlink r:id="rId2" w:history="1">
         <w:r>
@@ -8805,7 +8805,7 @@
           <w:sz w:val="16"/>
           <w:szCs w:val="16"/>
         </w:rPr>
-        <w:t xml:space="preserve">Valorisation retenue : 312,90 € par jour de travail, soit 44,70 € de l'heure (coût horaire moyen du travail, secteur marchand) sur 7 heures, pour toutes les démarches. Sensibilité avec des hypothèses propres à la fonction publique : seul le traitement indiciaire est public. À mi-carrière, il représente 15,5 € de l'heure brut pour un agent de catégorie B et 19,8 € pour la catégorie A (grilles des secrétaires administratifs et des attachés d'administration du ministère de l'Intérieur, point d'indice de 4,92278 €, 151,67 heures par mois). Avec un mélange selon la complexité (démarche simple : 70 % de B et 30 % de A ; modérée : 50 % et 50 % ; complexe : 30 % et 70 %), le traitement est de 16,8 €, 17,7 € et 18,5 € de l'heure, et le temps de mise en place des 34 185 démarches vaudrait 35 M€ au centre sur le seul traitement (de 17 à 53 M€ selon les hypothèses de temps). Les primes (IFSE), les cotisations patronales et la contribution de l'État aux pensions ne sont pas publiques agent par agent : on les représente par un coefficient sur le traitement. Les 44,70 € de l'heure retenus équivalent à un coefficient d'environ 2,4. Un coefficient de 2,0, qui correspondrait par exemple à des primes d'un quart du traitement et à des charges patronales de 50 %, hors contribution aux pensions (hypothèses de l'auteur), donnerait 70 M€ au centre (de 35 à 105 M€) au lieu de 85 M€ (de 42 à 130 M€), et un rapport gains / coûts avec la mise en place imputée de 1,3 à 6,3 (environ 2,9 à hypothèses appariées) au lieu de 1,1 à 5,5 (environ 2,5) ; un coefficient de 1,5 donnerait 52 M€ (de 26 à 79 M€). L'écart reste inférieur à l'incertitude sur le temps passé, et le détail des compléments de rémunération n'étant pas public, nous conservons une métrique unique, légèrement défavorable au rapport gains / coûts si le coefficient réel est inférieur à 2,4. Sources : traitements bruts mensuels des attachés d'administration (indices majorés 390 à 830, grille au 1er juillet 2023, majoration de 5 points d'indice au 1er janvier 2024 non incluse, soit environ 25 € bruts par mois) et des secrétaires administratifs (indices majorés 366 à 592), grilles publiées par le SMI-CFDT du ministère de l'Intérieur : </w:t>
+        <w:t xml:space="preserve">Valorisation retenue : 312,90 € par jour de travail, soit 44,70 € de l'heure (coût horaire moyen du travail, secteur marchand) sur 7 heures, pour toutes les démarches. Sensibilité avec des hypothèses propres à la fonction publique : seul le traitement indiciaire est public. À mi-carrière, il représente 15,5 € de l'heure brut pour un agent de catégorie B et 19,8 € pour la catégorie A (grilles des secrétaires administratifs et des attachés d'administration du ministère de l'Intérieur, point d'indice de 4,92278 €, 151,67 heures par mois). Avec un mélange selon la complexité (démarche simple : 70 % de B et 30 % de A ; modérée : 50 % et 50 % ; complexe : 30 % et 70 %), le traitement est de 16,8 €, 17,7 € et 18,5 € de l'heure, et le temps de mise en place des 34 185 démarches vaudrait 35 M€ au centre sur le seul traitement (de 17 à 53 M€ selon les hypothèses de temps). Les primes (IFSE), les cotisations patronales et la contribution de l'État aux pensions ne sont pas publiques agent par agent : on les représente par un coefficient sur le traitement. Les 44,70 € de l'heure retenus équivalent à un coefficient d'environ 2,4. Un coefficient de 2,0, qui correspondrait par exemple à des primes d'un quart du traitement et à des charges patronales de 50 %, hors contribution aux pensions (hypothèses de l'auteur), donnerait 70 M€ au centre (de 35 à 105 M€) au lieu de 85 M€ (de 42 à 130 M€), et un rapport gains / coûts avec la mise en place imputée de 1,4 à 7,4 (environ 3,3 à hypothèses appariées) au lieu de 1,2 à 6,3 (environ 2,8) ; un coefficient de 1,5 donnerait 52 M€ (de 26 à 79 M€). L'écart reste inférieur à l'incertitude sur le temps passé, et le détail des compléments de rémunération n'étant pas public, nous conservons une métrique unique, légèrement défavorable au rapport gains / coûts si le coefficient réel est inférieur à 2,4. Sources : traitements bruts mensuels des attachés d'administration (indices majorés 390 à 830, grille au 1er juillet 2023, majoration de 5 points d'indice au 1er janvier 2024 non incluse, soit environ 25 € bruts par mois) et des secrétaires administratifs (indices majorés 366 à 592), grilles publiées par le SMI-CFDT du ministère de l'Intérieur : </w:t>
       </w:r>
       <w:hyperlink r:id="rId19" w:history="1">
         <w:r>

</xml_diff>